<commit_message>
Refresh Battery Smart SPM resume onto current base (EXT24, 96%; ops-tech/internal-tools/growth)
Co-Authored-By: Claude Opus 4.8 <noreply@anthropic.com>
</commit_message>
<xml_diff>
--- a/resumes/Battery Smart-Senior Product Manager.docx
+++ b/resumes/Battery Smart-Senior Product Manager.docx
@@ -36,7 +36,7 @@
     </w:p>
     <w:p>
       <w:pPr>
-        <w:spacing w:after="60"/>
+        <w:spacing w:after="20"/>
         <w:jc w:val="center"/>
       </w:pPr>
       <w:r>
@@ -47,7 +47,53 @@
           <w:color w:val="444444"/>
           <w:sz w:val="18"/>
         </w:rPr>
-        <w:t>Gurugram, India  •  +91 8756972501  •  kshitizyadav788@gmail.com  •  linkedin.com/in/kshitizyadav</w:t>
+        <w:t xml:space="preserve">Gurugram, India  •  +91 8756972501  •  </w:t>
+      </w:r>
+      <w:hyperlink r:id="rId9">
+        <w:r>
+          <w:rPr>
+            <w:rFonts w:ascii="Calibri" w:hAnsi="Calibri"/>
+            <w:color w:val="444444"/>
+            <w:sz w:val="18"/>
+          </w:rPr>
+          <w:t xml:space="preserve">kshitizyadav788@gmail.com</w:t>
+        </w:r>
+      </w:hyperlink>
+      <w:r>
+        <w:rPr>
+          <w:rFonts w:ascii="Calibri" w:hAnsi="Calibri"/>
+          <w:b w:val="0"/>
+          <w:i w:val="0"/>
+          <w:color w:val="444444"/>
+          <w:sz w:val="18"/>
+        </w:rPr>
+        <w:t xml:space="preserve">  •  </w:t>
+      </w:r>
+      <w:hyperlink r:id="rId10">
+        <w:r>
+          <w:rPr>
+            <w:rFonts w:ascii="Calibri" w:hAnsi="Calibri"/>
+            <w:color w:val="444444"/>
+            <w:sz w:val="18"/>
+          </w:rPr>
+          <w:t xml:space="preserve">linkedin.com/in/kshitizyadav</w:t>
+        </w:r>
+      </w:hyperlink>
+    </w:p>
+    <w:p>
+      <w:pPr>
+        <w:spacing w:after="60"/>
+        <w:jc w:val="center"/>
+      </w:pPr>
+      <w:r>
+        <w:rPr>
+          <w:rFonts w:ascii="Calibri" w:hAnsi="Calibri"/>
+          <w:b/>
+          <w:i w:val="0"/>
+          <w:color w:val="2E5AAC"/>
+          <w:sz w:val="18"/>
+        </w:rPr>
+        <w:t>20% Revenue Growth   •   25% ARPU Expansion (₹35K → ₹45K)   •   ₹70L Renewals in a Single Month   •   80% Lower Ops Workload</w:t>
       </w:r>
     </w:p>
     <w:p>
@@ -78,202 +124,7 @@
           <w:i w:val="0"/>
           <w:sz w:val="19"/>
         </w:rPr>
-        <w:t>Senior-track Product Manager with 5+ years owning products end-to-end — from discovery and requirements through launch, experimentation, and scaling — across consumer digital products, a two-sided marketplace, and the internal ops, CRM, and automation platforms that run the business. Builds for both external customers and internal business users, partners across Engineering, Design, Operations, Growth, and Finance, and uses data (SQL, Power BI) to drive decisions. Track record of improving operational efficiency ~80% and driving 20% revenue growth.</w:t>
-      </w:r>
-    </w:p>
-    <w:p>
-      <w:pPr>
-        <w:spacing w:before="140" w:after="60"/>
-        <w:pBdr>
-          <w:bottom w:val="single" w:sz="6" w:space="1" w:color="2E5AAC"/>
-        </w:pBdr>
-      </w:pPr>
-      <w:r>
-        <w:rPr>
-          <w:rFonts w:ascii="Calibri" w:hAnsi="Calibri"/>
-          <w:b/>
-          <w:color w:val="1F3864"/>
-          <w:sz w:val="22"/>
-        </w:rPr>
-        <w:t>PROFESSIONAL EXPERIENCE</w:t>
-      </w:r>
-    </w:p>
-    <w:p>
-      <w:pPr>
-        <w:tabs>
-          <w:tab w:pos="10546" w:val="right"/>
-        </w:tabs>
-        <w:spacing w:after="0"/>
-      </w:pPr>
-      <w:r>
-        <w:rPr>
-          <w:rFonts w:ascii="Calibri" w:hAnsi="Calibri"/>
-          <w:b/>
-          <w:i w:val="0"/>
-          <w:sz w:val="21"/>
-        </w:rPr>
-        <w:t>PlanetSpark — Product Manager</w:t>
-      </w:r>
-      <w:r>
-        <w:rPr>
-          <w:rFonts w:ascii="Calibri" w:hAnsi="Calibri"/>
-          <w:b w:val="0"/>
-          <w:i w:val="0"/>
-          <w:color w:val="444444"/>
-          <w:sz w:val="19"/>
-        </w:rPr>
-        <w:tab/>
-        <w:t>Gurugram · Mar 2021 – Present</w:t>
-      </w:r>
-    </w:p>
-    <w:p>
-      <w:pPr>
-        <w:spacing w:after="60"/>
-      </w:pPr>
-      <w:r>
-        <w:rPr>
-          <w:rFonts w:ascii="Calibri" w:hAnsi="Calibri"/>
-          <w:b w:val="0"/>
-          <w:i/>
-          <w:color w:val="333333"/>
-          <w:sz w:val="19"/>
-        </w:rPr>
-        <w:t>Own the full product suite of a B2C EdTech marketplace -- one of India's largest public speaking &amp; creative writing platforms, connecting students and teachers via a shared LMS: consumer app, student &amp; teacher LMS, sales CRM, product-led growth &amp; renewal engine, and an in-house AI layer.</w:t>
-      </w:r>
-    </w:p>
-    <w:p>
-      <w:pPr>
-        <w:spacing w:before="80" w:after="0"/>
-      </w:pPr>
-      <w:r>
-        <w:rPr>
-          <w:rFonts w:ascii="Calibri" w:hAnsi="Calibri"/>
-          <w:b/>
-          <w:i/>
-          <w:color w:val="2E5AAC"/>
-          <w:sz w:val="19"/>
-        </w:rPr>
-        <w:t>Operations, Workforce Productivity &amp; Internal Tools</w:t>
-      </w:r>
-    </w:p>
-    <w:p>
-      <w:pPr>
-        <w:pStyle w:val="ListBullet"/>
-        <w:spacing w:after="60" w:before="0" w:line="278" w:lineRule="auto"/>
-      </w:pPr>
-      <w:r>
-        <w:rPr>
-          <w:rFonts w:ascii="Calibri" w:hAnsi="Calibri"/>
-          <w:b w:val="0"/>
-          <w:i w:val="0"/>
-          <w:sz w:val="19"/>
-        </w:rPr>
-        <w:t>Rebuilt the agent-facing Sales CRM into a single workforce workspace — lead navigation, integrated calling (Exotel, Servetel), real-time revenue and target-vs-achievement tracking, and incentive management — cutting sales-operations workload ~80% and freeing counselors to sell instead of doing admin.</w:t>
-      </w:r>
-    </w:p>
-    <w:p>
-      <w:pPr>
-        <w:pStyle w:val="ListBullet"/>
-        <w:spacing w:after="60" w:before="0" w:line="278" w:lineRule="auto"/>
-      </w:pPr>
-      <w:r>
-        <w:rPr>
-          <w:rFonts w:ascii="Calibri" w:hAnsi="Calibri"/>
-          <w:b w:val="0"/>
-          <w:i w:val="0"/>
-          <w:sz w:val="19"/>
-        </w:rPr>
-        <w:t>Automated internal business workflows end-to-end: backend revenue-punching (manual ~100% to 2%), enrolment verification (100% coverage), and incentive flows — saving Rs 1.6L/month, raising same-day revenue realization 70%, and eliminating fake-revenue reporting.</w:t>
-      </w:r>
-    </w:p>
-    <w:p>
-      <w:pPr>
-        <w:spacing w:before="80" w:after="0"/>
-      </w:pPr>
-      <w:r>
-        <w:rPr>
-          <w:rFonts w:ascii="Calibri" w:hAnsi="Calibri"/>
-          <w:b/>
-          <w:i/>
-          <w:color w:val="2E5AAC"/>
-          <w:sz w:val="19"/>
-        </w:rPr>
-        <w:t>Growth, Marketplace &amp; Customer Experience</w:t>
-      </w:r>
-    </w:p>
-    <w:p>
-      <w:pPr>
-        <w:pStyle w:val="ListBullet"/>
-        <w:spacing w:after="60" w:before="0" w:line="278" w:lineRule="auto"/>
-      </w:pPr>
-      <w:r>
-        <w:rPr>
-          <w:rFonts w:ascii="Calibri" w:hAnsi="Calibri"/>
-          <w:b w:val="0"/>
-          <w:i w:val="0"/>
-          <w:sz w:val="19"/>
-        </w:rPr>
-        <w:t>Own products across a two-sided marketplace (students and teachers) and consumer digital products — re-architected the sign-up → enrolment journey (single-step OTP, preference-based ranking, 6 payment gateways) and led the 0→1 launch of a consumer app MVP in 2 months, improving customer experience and conversion.</w:t>
-      </w:r>
-    </w:p>
-    <w:p>
-      <w:pPr>
-        <w:pStyle w:val="ListBullet"/>
-        <w:spacing w:after="60" w:before="0" w:line="278" w:lineRule="auto"/>
-      </w:pPr>
-      <w:r>
-        <w:rPr>
-          <w:rFonts w:ascii="Calibri" w:hAnsi="Calibri"/>
-          <w:b w:val="0"/>
-          <w:i w:val="0"/>
-          <w:sz w:val="19"/>
-        </w:rPr>
-        <w:t>Built monetization and retention capabilities (LPP module, in-product renewal engine) that drove 20% revenue growth, 25% ARPU expansion, and Rs 70L in product-led renewals in a single month.</w:t>
-      </w:r>
-    </w:p>
-    <w:p>
-      <w:pPr>
-        <w:spacing w:before="80" w:after="0"/>
-      </w:pPr>
-      <w:r>
-        <w:rPr>
-          <w:rFonts w:ascii="Calibri" w:hAnsi="Calibri"/>
-          <w:b/>
-          <w:i/>
-          <w:color w:val="2E5AAC"/>
-          <w:sz w:val="19"/>
-        </w:rPr>
-        <w:t>Data-Driven Decisions, Experimentation &amp; Team</w:t>
-      </w:r>
-    </w:p>
-    <w:p>
-      <w:pPr>
-        <w:pStyle w:val="ListBullet"/>
-        <w:spacing w:after="60" w:before="0" w:line="278" w:lineRule="auto"/>
-      </w:pPr>
-      <w:r>
-        <w:rPr>
-          <w:rFonts w:ascii="Calibri" w:hAnsi="Calibri"/>
-          <w:b w:val="0"/>
-          <w:i w:val="0"/>
-          <w:sz w:val="19"/>
-        </w:rPr>
-        <w:t>Define product requirements from customer insights, business priorities, and data; monitor product performance through SQL and Power BI dashboards and customer feedback, and drive data-driven decisions via A/B experimentation, analytics, and user research to deliver measurable business outcomes.</w:t>
-      </w:r>
-    </w:p>
-    <w:p>
-      <w:pPr>
-        <w:pStyle w:val="ListBullet"/>
-        <w:spacing w:after="60" w:before="0" w:line="278" w:lineRule="auto"/>
-      </w:pPr>
-      <w:r>
-        <w:rPr>
-          <w:rFonts w:ascii="Calibri" w:hAnsi="Calibri"/>
-          <w:b w:val="0"/>
-          <w:i w:val="0"/>
-          <w:sz w:val="19"/>
-        </w:rPr>
-        <w:t>Trained and mentored a team of 8, strengthening product and operations practices, while partnering across Engineering, Design, Operations, Growth, and Finance in an Agile, fast-paced startup.</w:t>
+        <w:t>Senior-track Product Manager with 5+ years owning products end-to-end, from discovery and requirements through launch, experimentation, and scaling, across consumer digital products, a two-sided marketplace, and the internal ops, CRM, and automation platforms that run the business. Builds for both external customers and internal business users, partners across engineering, design, operations, growth, and finance, and uses data (SQL, Power BI) to drive decisions. Track record of improving operational efficiency ~80% and driving 20% revenue growth.</w:t>
       </w:r>
     </w:p>
     <w:p>
@@ -304,7 +155,260 @@
           <w:i w:val="0"/>
           <w:sz w:val="19"/>
         </w:rPr>
-        <w:t>End-to-End Product Ownership (Ideation to Launch &amp; Scale) · Product Discovery, Roadmap Planning, Prioritization &amp; Trade-offs (Impact vs Effort) · Operations &amp; Workforce-Productivity Platforms · Internal Business Tools &amp; Automation · Growth &amp; Marketplace Products · Customer Experience &amp; Digital Products · Data, Reporting &amp; BI (SQL, Power BI) · Experimentation, Analytics &amp; User Research · Translating Business Problems into Scalable Solutions · Stakeholder Management &amp; Cross-Functional Delivery (Eng, Design, Ops, Growth, Finance) · Agile Delivery · Mentoring APMs</w:t>
+        <w:t>End-to-End Product Ownership (Ideation to Launch &amp; Scale) · Product Discovery &amp; Roadmap Planning · Prioritization &amp; Trade-offs (Impact vs Effort) · Operations &amp; Workforce-Productivity Platforms · Internal Business Tools &amp; Automation · Growth &amp; Marketplace Products · Customer Experience &amp; Digital Products · Data, Reporting &amp; BI (SQL, Power BI) · Experimentation, Analytics &amp; User Research · Translating Business Problems into Scalable Solutions · Stakeholder Management &amp; Cross-Functional Delivery (Eng, Design, Ops, Growth, Finance) · Agile Delivery · Mentoring &amp; Team Leadership · Product Management</w:t>
+      </w:r>
+    </w:p>
+    <w:p>
+      <w:pPr>
+        <w:spacing w:before="140" w:after="60"/>
+        <w:pBdr>
+          <w:bottom w:val="single" w:sz="6" w:space="1" w:color="2E5AAC"/>
+        </w:pBdr>
+      </w:pPr>
+      <w:r>
+        <w:rPr>
+          <w:rFonts w:ascii="Calibri" w:hAnsi="Calibri"/>
+          <w:b/>
+          <w:color w:val="1F3864"/>
+          <w:sz w:val="22"/>
+        </w:rPr>
+        <w:t>PROFESSIONAL EXPERIENCE</w:t>
+      </w:r>
+    </w:p>
+    <w:p>
+      <w:pPr>
+        <w:spacing w:after="0"/>
+      </w:pPr>
+      <w:r>
+        <w:rPr>
+          <w:rFonts w:ascii="Calibri" w:hAnsi="Calibri"/>
+          <w:b/>
+          <w:i w:val="0"/>
+          <w:sz w:val="21"/>
+        </w:rPr>
+        <w:t>PlanetSpark — Gurugram</w:t>
+      </w:r>
+    </w:p>
+    <w:p>
+      <w:pPr>
+        <w:spacing w:after="60"/>
+      </w:pPr>
+      <w:r>
+        <w:rPr>
+          <w:rFonts w:ascii="Calibri" w:hAnsi="Calibri"/>
+          <w:b w:val="0"/>
+          <w:i/>
+          <w:color w:val="333333"/>
+          <w:sz w:val="19"/>
+        </w:rPr>
+        <w:t>A B2C consumer marketplace (EdTech) connecting 150,000+ enrolled users with teachers via a shared LMS — spanning consumer app, two-sided platform, payments, CRM, renewals, and lifecycle products, with 30,000+ daily active users. Progressed across three roles while owning an expanding product surface.</w:t>
+      </w:r>
+    </w:p>
+    <w:p>
+      <w:pPr>
+        <w:tabs>
+          <w:tab w:pos="10546" w:val="right"/>
+        </w:tabs>
+        <w:spacing w:before="80" w:after="0"/>
+      </w:pPr>
+      <w:r>
+        <w:rPr>
+          <w:rFonts w:ascii="Calibri" w:hAnsi="Calibri"/>
+          <w:b/>
+          <w:i/>
+          <w:color w:val="2E5AAC"/>
+          <w:sz w:val="19"/>
+        </w:rPr>
+        <w:t>Product Manager</w:t>
+      </w:r>
+      <w:r>
+        <w:rPr>
+          <w:rFonts w:ascii="Calibri" w:hAnsi="Calibri"/>
+          <w:b w:val="0"/>
+          <w:i/>
+          <w:color w:val="444444"/>
+          <w:sz w:val="19"/>
+        </w:rPr>
+        <w:tab/>
+        <w:t>Sep 2023 – Present</w:t>
+      </w:r>
+    </w:p>
+    <w:p>
+      <w:pPr>
+        <w:pStyle w:val="ListBullet"/>
+        <w:spacing w:after="60" w:before="0" w:line="278" w:lineRule="auto"/>
+      </w:pPr>
+      <w:r>
+        <w:rPr>
+          <w:rFonts w:ascii="Calibri" w:hAnsi="Calibri"/>
+          <w:b w:val="0"/>
+          <w:i w:val="0"/>
+          <w:sz w:val="19"/>
+        </w:rPr>
+        <w:t>Own products end-to-end, ideation to launch to scale, for both external customers and internal business users on a two-sided marketplace of 150,000+ users, leading cross-functional work across engineering, design, operations, growth, and finance.</w:t>
+      </w:r>
+    </w:p>
+    <w:p>
+      <w:pPr>
+        <w:pStyle w:val="ListBullet"/>
+        <w:spacing w:after="60" w:before="0" w:line="278" w:lineRule="auto"/>
+      </w:pPr>
+      <w:r>
+        <w:rPr>
+          <w:rFonts w:ascii="Calibri" w:hAnsi="Calibri"/>
+          <w:b w:val="0"/>
+          <w:i w:val="0"/>
+          <w:sz w:val="19"/>
+        </w:rPr>
+        <w:t>Re-architected the acquisition-to-conversion funnel (single-step OTP, ranking, 6 payment gateways) and built retention and monetization (renewal engine, Rs 70L in a single month), improving customer experience and conversion.</w:t>
+      </w:r>
+    </w:p>
+    <w:p>
+      <w:pPr>
+        <w:pStyle w:val="ListBullet"/>
+        <w:spacing w:after="60" w:before="0" w:line="278" w:lineRule="auto"/>
+      </w:pPr>
+      <w:r>
+        <w:rPr>
+          <w:rFonts w:ascii="Calibri" w:hAnsi="Calibri"/>
+          <w:b w:val="0"/>
+          <w:i w:val="0"/>
+          <w:sz w:val="19"/>
+        </w:rPr>
+        <w:t>Built a P&amp;L and product-KPI tracker in SQL and Power BI, translating business problems into scalable solutions and driving data-driven decisions (profitable advisors rose from ~50 to 125 over three months).</w:t>
+      </w:r>
+    </w:p>
+    <w:p>
+      <w:pPr>
+        <w:tabs>
+          <w:tab w:pos="10546" w:val="right"/>
+        </w:tabs>
+        <w:spacing w:before="80" w:after="0"/>
+      </w:pPr>
+      <w:r>
+        <w:rPr>
+          <w:rFonts w:ascii="Calibri" w:hAnsi="Calibri"/>
+          <w:b/>
+          <w:i/>
+          <w:color w:val="2E5AAC"/>
+          <w:sz w:val="19"/>
+        </w:rPr>
+        <w:t>Assistant Product Manager</w:t>
+      </w:r>
+      <w:r>
+        <w:rPr>
+          <w:rFonts w:ascii="Calibri" w:hAnsi="Calibri"/>
+          <w:b w:val="0"/>
+          <w:i/>
+          <w:color w:val="444444"/>
+          <w:sz w:val="19"/>
+        </w:rPr>
+        <w:tab/>
+        <w:t>Sep 2022 – Aug 2023</w:t>
+      </w:r>
+    </w:p>
+    <w:p>
+      <w:pPr>
+        <w:pStyle w:val="ListBullet"/>
+        <w:spacing w:after="60" w:before="0" w:line="278" w:lineRule="auto"/>
+      </w:pPr>
+      <w:r>
+        <w:rPr>
+          <w:rFonts w:ascii="Calibri" w:hAnsi="Calibri"/>
+          <w:b w:val="0"/>
+          <w:i w:val="0"/>
+          <w:sz w:val="19"/>
+        </w:rPr>
+        <w:t>Rebuilt the agent-facing Sales CRM into one workforce-productivity workspace, lead navigation, integrated calling (Exotel, Servetel), target-vs-achievement tracking, and incentive management, cutting sales-operations workload ~80% and freeing agents to sell instead of doing admin.</w:t>
+      </w:r>
+    </w:p>
+    <w:p>
+      <w:pPr>
+        <w:pStyle w:val="ListBullet"/>
+        <w:spacing w:after="60" w:before="0" w:line="278" w:lineRule="auto"/>
+      </w:pPr>
+      <w:r>
+        <w:rPr>
+          <w:rFonts w:ascii="Calibri" w:hAnsi="Calibri"/>
+          <w:b w:val="0"/>
+          <w:i w:val="0"/>
+          <w:sz w:val="19"/>
+        </w:rPr>
+        <w:t>Automated internal business workflows end-to-end, backend revenue-punching (manual ~100% to 2%), enrolment verification, and incentive flows, saving Rs 1.6L/month, lifting same-day revenue realization 70%, and eliminating fake-revenue reporting.</w:t>
+      </w:r>
+    </w:p>
+    <w:p>
+      <w:pPr>
+        <w:pStyle w:val="ListBullet"/>
+        <w:spacing w:after="60" w:before="0" w:line="278" w:lineRule="auto"/>
+      </w:pPr>
+      <w:r>
+        <w:rPr>
+          <w:rFonts w:ascii="Calibri" w:hAnsi="Calibri"/>
+          <w:b w:val="0"/>
+          <w:i w:val="0"/>
+          <w:sz w:val="19"/>
+        </w:rPr>
+        <w:t>Built the LPP monetization module (20% revenue growth, 25% ARPU expansion) and trained and mentored a team of 8, strengthening product and operations practices in an Agile, fast-paced startup.</w:t>
+      </w:r>
+    </w:p>
+    <w:p>
+      <w:pPr>
+        <w:tabs>
+          <w:tab w:pos="10546" w:val="right"/>
+        </w:tabs>
+        <w:spacing w:before="80" w:after="0"/>
+      </w:pPr>
+      <w:r>
+        <w:rPr>
+          <w:rFonts w:ascii="Calibri" w:hAnsi="Calibri"/>
+          <w:b/>
+          <w:i/>
+          <w:color w:val="2E5AAC"/>
+          <w:sz w:val="19"/>
+        </w:rPr>
+        <w:t>Senior Product Analyst</w:t>
+      </w:r>
+      <w:r>
+        <w:rPr>
+          <w:rFonts w:ascii="Calibri" w:hAnsi="Calibri"/>
+          <w:b w:val="0"/>
+          <w:i/>
+          <w:color w:val="444444"/>
+          <w:sz w:val="19"/>
+        </w:rPr>
+        <w:tab/>
+        <w:t>Mar 2021 – Aug 2022</w:t>
+      </w:r>
+    </w:p>
+    <w:p>
+      <w:pPr>
+        <w:pStyle w:val="ListBullet"/>
+        <w:spacing w:after="60" w:before="0" w:line="278" w:lineRule="auto"/>
+      </w:pPr>
+      <w:r>
+        <w:rPr>
+          <w:rFonts w:ascii="Calibri" w:hAnsi="Calibri"/>
+          <w:b w:val="0"/>
+          <w:i w:val="0"/>
+          <w:sz w:val="19"/>
+        </w:rPr>
+        <w:t>Built SQL and Power BI dashboards (from Metabase) and ran A/B experimentation, analytics, and user research to prioritise improvements and measure business outcomes.</w:t>
+      </w:r>
+    </w:p>
+    <w:p>
+      <w:pPr>
+        <w:pStyle w:val="ListBullet"/>
+        <w:spacing w:after="60" w:before="0" w:line="278" w:lineRule="auto"/>
+      </w:pPr>
+      <w:r>
+        <w:rPr>
+          <w:rFonts w:ascii="Calibri" w:hAnsi="Calibri"/>
+          <w:b w:val="0"/>
+          <w:i w:val="0"/>
+          <w:sz w:val="19"/>
+        </w:rPr>
+        <w:t>Implemented customer and transaction-verification controls that cut invalid or fraudulent transactions from 10% to 1%, improving quality and trust with minimal manual intervention.</w:t>
       </w:r>
     </w:p>
     <w:p>
@@ -369,7 +473,7 @@
           <w:i w:val="0"/>
           <w:sz w:val="19"/>
         </w:rPr>
-        <w:t>JIRA, Confluence, Agile/Scrum, product discovery, roadmap, RICE prioritisation</w:t>
+        <w:t>JIRA, Confluence, Agile/Scrum, product discovery, roadmap, RICE prioritization</w:t>
       </w:r>
     </w:p>
     <w:p>
@@ -408,7 +512,7 @@
           <w:i w:val="0"/>
           <w:sz w:val="19"/>
         </w:rPr>
-        <w:t xml:space="preserve">AI &amp; Design: </w:t>
+        <w:t xml:space="preserve">AI &amp; Tools: </w:t>
       </w:r>
       <w:r>
         <w:rPr>
@@ -417,7 +521,7 @@
           <w:i w:val="0"/>
           <w:sz w:val="19"/>
         </w:rPr>
-        <w:t>OpenAI / Gemini / Claude APIs, Prompt Engineering, Figma, wireframing</w:t>
+        <w:t>OpenAI / Gemini / Claude APIs, Claude Code, Prompt Engineering, RAG, Figma</w:t>
       </w:r>
     </w:p>
     <w:p>
@@ -434,7 +538,7 @@
           <w:color w:val="1F3864"/>
           <w:sz w:val="22"/>
         </w:rPr>
-        <w:t>EDUCATION</w:t>
+        <w:t>EDUCATION &amp; CERTIFICATIONS</w:t>
       </w:r>
     </w:p>
     <w:p>
@@ -462,25 +566,13 @@
           <w:sz w:val="19"/>
         </w:rPr>
         <w:tab/>
-        <w:t>2019 – 2021</w:t>
+        <w:t>2018 – 2021</w:t>
       </w:r>
     </w:p>
     <w:p>
       <w:pPr>
-        <w:tabs>
-          <w:tab w:pos="10546" w:val="right"/>
-        </w:tabs>
         <w:spacing w:after="60"/>
       </w:pPr>
-      <w:r>
-        <w:rPr>
-          <w:rFonts w:ascii="Calibri" w:hAnsi="Calibri"/>
-          <w:b/>
-          <w:i w:val="0"/>
-          <w:sz w:val="19"/>
-        </w:rPr>
-        <w:t>Class XII (ISC), St. Thomas High School, Kanpur</w:t>
-      </w:r>
       <w:r>
         <w:rPr>
           <w:rFonts w:ascii="Calibri" w:hAnsi="Calibri"/>
@@ -489,40 +581,7 @@
           <w:color w:val="444444"/>
           <w:sz w:val="19"/>
         </w:rPr>
-        <w:tab/>
-        <w:t>2018</w:t>
-      </w:r>
-    </w:p>
-    <w:p>
-      <w:pPr>
-        <w:spacing w:before="140" w:after="60"/>
-        <w:pBdr>
-          <w:bottom w:val="single" w:sz="6" w:space="1" w:color="2E5AAC"/>
-        </w:pBdr>
-      </w:pPr>
-      <w:r>
-        <w:rPr>
-          <w:rFonts w:ascii="Calibri" w:hAnsi="Calibri"/>
-          <w:b/>
-          <w:color w:val="1F3864"/>
-          <w:sz w:val="22"/>
-        </w:rPr>
-        <w:t>CERTIFICATIONS</w:t>
-      </w:r>
-    </w:p>
-    <w:p>
-      <w:pPr>
-        <w:pStyle w:val="ListBullet"/>
-        <w:spacing w:after="60" w:before="0" w:line="278" w:lineRule="auto"/>
-      </w:pPr>
-      <w:r>
-        <w:rPr>
-          <w:rFonts w:ascii="Calibri" w:hAnsi="Calibri"/>
-          <w:b w:val="0"/>
-          <w:i w:val="0"/>
-          <w:sz w:val="19"/>
-        </w:rPr>
-        <w:t>Product Management Certification — Udemy (2024)    •    JIRA Certification — Udemy (2024)</w:t>
+        <w:t>Product Management Certification — Udemy (2024)    •    Portfolio: kshitizyadav788-svg.github.io/career-dashboard/portfolio.html</w:t>
       </w:r>
     </w:p>
     <w:sectPr>

</xml_diff>